<commit_message>
Add Callitriche stagnalis water starwort detections to v40; correct BLAST species artifact
</commit_message>
<xml_diff>
--- a/output/MBTS_eDNA_Report_v40.docx
+++ b/output/MBTS_eDNA_Report_v40.docx
@@ -2395,6 +2395,14 @@
     </w:p>
     <w:p>
       <w:pPr>
+        <w:pStyle w:val="BodyText"/>
+      </w:pPr>
+      <w:r>
+        <w:t xml:space="preserve">Water starwort note: Callitriche sp. (likely Callitriche stagnalis, common water starwort) is confirmed at this site by 23S chloroplast eDNA. The genus is unambiguous; BLAST returns C. obtusangula only because that species has a published chloroplast genome in GenBank while C. stagnalis does not — the barcode cannot distinguish between Callitriche species (n_species = 100 at equivalent identity). C. stagnalis is the characteristic water starwort of New England soft-water streams and is consistent with the visual identification at this site. Its presence indicates submerged or emergent aquatic vegetation in the stream channel — positive habitat structure for macroinvertebrates and juvenile fish.</w:t>
+      </w:r>
+    </w:p>
+    <w:p>
+      <w:pPr>
         <w:pStyle w:val="FirstParagraph"/>
       </w:pPr>
       <w:r>
@@ -3280,6 +3288,14 @@
       </w:pPr>
       <w:r>
         <w:t xml:space="preserve">Below School St is a functioning tidal transition ecosystem. Brook Trout consistently detected at this site indicate upstream refugia in the watershed. eDNA degrades faster in saline water than in freshwater [T7]; the true Brook Trout signal from upstream reaches may be understated at this tidal sampling point. Moving the sampling location further upstream is worth considering.</w:t>
+      </w:r>
+    </w:p>
+    <w:p>
+      <w:pPr>
+        <w:pStyle w:val="BodyText"/>
+      </w:pPr>
+      <w:r>
+        <w:t xml:space="preserve">Water starwort note: Callitriche sp. (likely Callitriche stagnalis, common water starwort) is confirmed at this site by 23S chloroplast eDNA. The genus is unambiguous; BLAST returns C. obtusangula only because that species has a published chloroplast genome in GenBank while C. stagnalis does not — the barcode cannot distinguish between Callitriche species (n_species = 100 at equivalent identity). C. stagnalis is the characteristic water starwort of New England soft-water streams and is consistent with the visual identification at this site. Its presence indicates submerged or emergent aquatic vegetation in the stream channel — positive habitat structure for macroinvertebrates and juvenile fish.</w:t>
       </w:r>
     </w:p>
     <w:p>
@@ -8776,6 +8792,14 @@
       </w:pPr>
       <w:r>
         <w:t xml:space="preserve">Stonewort BLAST update — Lower Golf Course / Sawmill Brook: Native Characeae dominates the 23S signal (32.8% of reads) — the highest aquatic macrophyte detection across all MBTS sites. This is a stream reach (lower golf course boundary, Sawmill Brook), so the Characeae signal reflects benthic stonewort beds or adjacent wetland margin vegetation in contact with flowing water. A trace of Nitellopsis obtusa (1.0%) is also detected. Nitellopsis obtusa is an invasive stonewort from Eurasia established in multiple Massachusetts waterbodies; at 1.0% read abundance a self-sustaining population cannot be confirmed from eDNA alone, but a physical survey of the stream margin is warranted. The dominant native Characeae signal is a positive habitat indicator consistent with oligotrophic, clear-water conditions and Brook Trout connectivity at this reach.</w:t>
+      </w:r>
+    </w:p>
+    <w:p>
+      <w:pPr>
+        <w:pStyle w:val="BodyText"/>
+      </w:pPr>
+      <w:r>
+        <w:t xml:space="preserve">Water starwort note: Callitriche sp. (likely C. stagnalis) is also detected via 23S chloroplast eDNA at the lower golf course reach (32 reads) — lower read depth than Below School St and Upper Sawmill but consistent with plant material in stream contact. See those site entries for a note on the BLAST species call limitation.</w:t>
       </w:r>
     </w:p>
     <w:p>

</xml_diff>